<commit_message>
feat: add Typst-to-DOCX publisher script and reference template for GBK formatting
</commit_message>
<xml_diff>
--- a/config/templates/reference-gbk.docx
+++ b/config/templates/reference-gbk.docx
@@ -644,9 +644,6 @@
     <w:pPr>
       <w:keepNext/>
       <w:keepLines/>
-      <w:numPr>
-        <w:numId w:val="1"/>
-      </w:numPr>
       <w:ind w:firstLineChars="200" w:firstLine="640"/>
       <w:outlineLvl w:val="0"/>
       <w:spacing w:line="600" w:lineRule="exact"/>
@@ -668,9 +665,6 @@
     <w:pPr>
       <w:keepNext/>
       <w:keepLines/>
-      <w:numPr>
-        <w:numId w:val="2"/>
-      </w:numPr>
       <w:ind w:firstLineChars="200" w:firstLine="640"/>
       <w:outlineLvl w:val="1"/>
       <w:spacing w:line="600" w:lineRule="exact"/>
@@ -692,9 +686,6 @@
     <w:pPr>
       <w:keepNext/>
       <w:keepLines/>
-      <w:numPr>
-        <w:numId w:val="3"/>
-      </w:numPr>
       <w:ind w:firstLineChars="200" w:firstLine="640"/>
       <w:outlineLvl w:val="2"/>
       <w:spacing w:line="600" w:lineRule="exact"/>
@@ -716,9 +707,6 @@
     <w:pPr>
       <w:keepNext/>
       <w:keepLines/>
-      <w:numPr>
-        <w:numId w:val="4"/>
-      </w:numPr>
       <w:ind w:firstLineChars="200" w:firstLine="640"/>
       <w:outlineLvl w:val="3"/>
       <w:spacing w:line="600" w:lineRule="exact"/>
@@ -909,6 +897,22 @@
         </w:tcBorders>
       </w:tcPr>
     </w:tblStylePr>
+  </w:style>
+  <w:style w:type="paragraph" w:styleId="Subtitle">
+    <w:name w:val="Subtitle"/>
+    <w:basedOn w:val="a"/>
+    <w:next w:val="a"/>
+    <w:qFormat/>
+    <w:pPr>
+      <w:spacing w:line="600" w:lineRule="exact"/>
+      <w:jc w:val="center"/>
+      <w:ind w:firstLine="0" w:firstLineChars="0"/>
+    </w:pPr>
+    <w:rPr>
+      <w:rFonts w:eastAsia="方正楷体_GBK" w:ascii="Times New Roman" w:hAnsi="Times New Roman" w:cs="Times New Roman"/>
+      <w:sz w:val="32"/>
+      <w:szCs w:val="32"/>
+    </w:rPr>
   </w:style>
 </w:styles>
 </file>

</xml_diff>

<commit_message>
feat: add typst-docx-publisher script and default document templates
</commit_message>
<xml_diff>
--- a/config/templates/reference-gbk.docx
+++ b/config/templates/reference-gbk.docx
@@ -1,8 +1,728 @@
 
 <file path=word/document.xml><?xml version="1.0" encoding="utf-8"?>
-<w:document xmlns:r="http://schemas.openxmlformats.org/officeDocument/2006/relationships" xmlns:w="http://schemas.openxmlformats.org/wordprocessingml/2006/main">
+<w:document xmlns:wpc="http://schemas.microsoft.com/office/word/2010/wordprocessingCanvas" xmlns:cx="http://schemas.microsoft.com/office/drawing/2014/chartex" xmlns:cx1="http://schemas.microsoft.com/office/drawing/2015/9/8/chartex" xmlns:cx2="http://schemas.microsoft.com/office/drawing/2015/10/21/chartex" xmlns:cx3="http://schemas.microsoft.com/office/drawing/2016/5/9/chartex" xmlns:cx4="http://schemas.microsoft.com/office/drawing/2016/5/10/chartex" xmlns:cx5="http://schemas.microsoft.com/office/drawing/2016/5/11/chartex" xmlns:cx6="http://schemas.microsoft.com/office/drawing/2016/5/12/chartex" xmlns:cx7="http://schemas.microsoft.com/office/drawing/2016/5/13/chartex" xmlns:cx8="http://schemas.microsoft.com/office/drawing/2016/5/14/chartex" xmlns:mc="http://schemas.openxmlformats.org/markup-compatibility/2006" xmlns:aink="http://schemas.microsoft.com/office/drawing/2016/ink" xmlns:am3d="http://schemas.microsoft.com/office/drawing/2017/model3d" xmlns:o="urn:schemas-microsoft-com:office:office" xmlns:r="http://schemas.openxmlformats.org/officeDocument/2006/relationships" xmlns:m="http://schemas.openxmlformats.org/officeDocument/2006/math" xmlns:v="urn:schemas-microsoft-com:vml" xmlns:wp14="http://schemas.microsoft.com/office/word/2010/wordprocessingDrawing" xmlns:wp="http://schemas.openxmlformats.org/drawingml/2006/wordprocessingDrawing" xmlns:w10="urn:schemas-microsoft-com:office:word" xmlns:w="http://schemas.openxmlformats.org/wordprocessingml/2006/main" xmlns:w14="http://schemas.microsoft.com/office/word/2010/wordml" xmlns:w15="http://schemas.microsoft.com/office/word/2012/wordml" xmlns:w16cex="http://schemas.microsoft.com/office/word/2018/wordml/cex" xmlns:w16cid="http://schemas.microsoft.com/office/word/2016/wordml/cid" xmlns:w16="http://schemas.microsoft.com/office/word/2018/wordml" xmlns:w16sdtdh="http://schemas.microsoft.com/office/word/2020/wordml/sdtdatahash" xmlns:w16se="http://schemas.microsoft.com/office/word/2015/wordml/symex" xmlns:wpg="http://schemas.microsoft.com/office/word/2010/wordprocessingGroup" xmlns:wpi="http://schemas.microsoft.com/office/word/2010/wordprocessingInk" xmlns:wne="http://schemas.microsoft.com/office/word/2006/wordml" xmlns:wps="http://schemas.microsoft.com/office/word/2010/wordprocessingShape" mc:Ignorable="w14 w15 w16se w16cid w16 w16cex w16sdtdh wp14">
   <w:body>
-    <w:p/>
+    <w:p>
+      <w:pPr>
+        <w:pStyle w:val="a7"/>
+        <w:rPr>
+          <w:rFonts w:hint="eastAsia"/>
+        </w:rPr>
+      </w:pPr>
+      <w:r>
+        <w:rPr>
+          <w:rFonts w:hint="eastAsia"/>
+        </w:rPr>
+        <w:t>建设背景与总体目标</w:t>
+      </w:r>
+    </w:p>
+    <w:p>
+      <w:pPr>
+        <w:ind w:firstLine="480"/>
+        <w:rPr>
+          <w:rFonts w:hint="eastAsia"/>
+        </w:rPr>
+      </w:pPr>
+      <w:r>
+        <w:rPr>
+          <w:rFonts w:hint="eastAsia"/>
+        </w:rPr>
+        <w:t>重庆市城投路桥管理有限公司（以下简称“城投路桥公司”）成立于</w:t>
+      </w:r>
+      <w:r>
+        <w:rPr>
+          <w:rFonts w:hint="eastAsia"/>
+        </w:rPr>
+        <w:t xml:space="preserve"> 2002 </w:t>
+      </w:r>
+      <w:r>
+        <w:rPr>
+          <w:rFonts w:hint="eastAsia"/>
+        </w:rPr>
+        <w:t>年</w:t>
+      </w:r>
+      <w:r>
+        <w:rPr>
+          <w:rFonts w:hint="eastAsia"/>
+        </w:rPr>
+        <w:t xml:space="preserve"> 7 </w:t>
+      </w:r>
+      <w:r>
+        <w:rPr>
+          <w:rFonts w:hint="eastAsia"/>
+        </w:rPr>
+        <w:t>月，作为重庆市城建投资（集团）有限公司的核心子公司，肩负着重庆超大城市核心交通基础设施管养的战略使命。公司目前主要负责朝天门长江大桥、菜园坝长江大桥、千厮门嘉陵江大桥等</w:t>
+      </w:r>
+      <w:r>
+        <w:rPr>
+          <w:rFonts w:hint="eastAsia"/>
+        </w:rPr>
+        <w:t xml:space="preserve"> 12 </w:t>
+      </w:r>
+      <w:r>
+        <w:rPr>
+          <w:rFonts w:hint="eastAsia"/>
+        </w:rPr>
+        <w:t>座特大型跨江桥梁，以及双碑隧道等</w:t>
+      </w:r>
+      <w:r>
+        <w:rPr>
+          <w:rFonts w:hint="eastAsia"/>
+        </w:rPr>
+        <w:t xml:space="preserve"> 4 </w:t>
+      </w:r>
+      <w:r>
+        <w:rPr>
+          <w:rFonts w:hint="eastAsia"/>
+        </w:rPr>
+        <w:t>个重要隧道的管养任务，管理资产规模已超过</w:t>
+      </w:r>
+      <w:r>
+        <w:rPr>
+          <w:rFonts w:hint="eastAsia"/>
+        </w:rPr>
+        <w:t xml:space="preserve"> 500 </w:t>
+      </w:r>
+      <w:r>
+        <w:rPr>
+          <w:rFonts w:hint="eastAsia"/>
+        </w:rPr>
+        <w:t>亿元。</w:t>
+      </w:r>
+    </w:p>
+    <w:p>
+      <w:pPr>
+        <w:pStyle w:val="1"/>
+        <w:rPr>
+          <w:rFonts w:hint="eastAsia"/>
+        </w:rPr>
+      </w:pPr>
+      <w:r>
+        <w:rPr>
+          <w:rFonts w:hint="eastAsia"/>
+        </w:rPr>
+        <w:t>建设背景与行业环境</w:t>
+      </w:r>
+    </w:p>
+    <w:p>
+      <w:pPr>
+        <w:ind w:firstLine="480"/>
+        <w:rPr>
+          <w:rFonts w:hint="eastAsia"/>
+        </w:rPr>
+      </w:pPr>
+      <w:r>
+        <w:rPr>
+          <w:rFonts w:hint="eastAsia"/>
+        </w:rPr>
+        <w:t>面对设施步入“中老龄”周期以及多病害并发的物理挑战，传统“以人工巡检为主、被动养护为主”的保障型管养模式已难以支撑大规模、高复杂性的物理资产安全运营需求。数字化转型的核心机理在于建立“数据驱动、主动预防”运维体系。</w:t>
+      </w:r>
+    </w:p>
+    <w:p>
+      <w:pPr>
+        <w:pStyle w:val="2"/>
+        <w:rPr>
+          <w:rFonts w:hint="eastAsia"/>
+        </w:rPr>
+      </w:pPr>
+      <w:r>
+        <w:rPr>
+          <w:rFonts w:hint="eastAsia"/>
+        </w:rPr>
+        <w:t>建设背景与公司概况</w:t>
+      </w:r>
+    </w:p>
+    <w:p>
+      <w:pPr>
+        <w:ind w:firstLine="480"/>
+        <w:rPr>
+          <w:rFonts w:hint="eastAsia"/>
+        </w:rPr>
+      </w:pPr>
+      <w:r>
+        <w:rPr>
+          <w:rFonts w:hint="eastAsia"/>
+        </w:rPr>
+        <w:t>通过在</w:t>
+      </w:r>
+      <w:r>
+        <w:rPr>
+          <w:rFonts w:hint="eastAsia"/>
+        </w:rPr>
+        <w:t xml:space="preserve"> 12 </w:t>
+      </w:r>
+      <w:r>
+        <w:rPr>
+          <w:rFonts w:hint="eastAsia"/>
+        </w:rPr>
+        <w:t>桥</w:t>
+      </w:r>
+      <w:r>
+        <w:rPr>
+          <w:rFonts w:hint="eastAsia"/>
+        </w:rPr>
+        <w:t xml:space="preserve"> 4 </w:t>
+      </w:r>
+      <w:r>
+        <w:rPr>
+          <w:rFonts w:hint="eastAsia"/>
+        </w:rPr>
+        <w:t>隧的核心关键受力部位与脆弱节点布设高精度物联传感器，构建全域多源物联感知网络，确保物理构件级别的数据流实时、高频输入，奠定决策的数据底盘。</w:t>
+      </w:r>
+    </w:p>
+    <w:p>
+      <w:pPr>
+        <w:pStyle w:val="3"/>
+        <w:ind w:firstLine="643"/>
+        <w:rPr>
+          <w:rFonts w:hint="eastAsia"/>
+        </w:rPr>
+      </w:pPr>
+      <w:r>
+        <w:rPr>
+          <w:rFonts w:hint="eastAsia"/>
+        </w:rPr>
+        <w:t>政策指引与战略支撑</w:t>
+      </w:r>
+    </w:p>
+    <w:p>
+      <w:pPr>
+        <w:ind w:firstLine="480"/>
+        <w:rPr>
+          <w:rFonts w:hint="eastAsia"/>
+        </w:rPr>
+      </w:pPr>
+      <w:r>
+        <w:rPr>
+          <w:rFonts w:hint="eastAsia"/>
+        </w:rPr>
+        <w:t>交通运输部与住建部相继发布关于推进城市生命线安全工程建设与基础设施数字化转型的指导文件，要求全面提升特大跨江桥梁与关键隧道的结构安全监测覆盖率与预警处置时效性。</w:t>
+      </w:r>
+    </w:p>
+    <w:p>
+      <w:pPr>
+        <w:ind w:firstLine="480"/>
+        <w:rPr>
+          <w:rFonts w:hint="eastAsia"/>
+        </w:rPr>
+      </w:pPr>
+      <w:r>
+        <w:rPr>
+          <w:rFonts w:hint="eastAsia"/>
+        </w:rPr>
+        <w:t>“从被动修补转向主动预防，从经验判断走向数据决策，是超大城市交通基础设施数智化转型的必由之路。”</w:t>
+      </w:r>
+    </w:p>
+    <w:p>
+      <w:pPr>
+        <w:pStyle w:val="a9"/>
+        <w:rPr>
+          <w:rFonts w:hint="eastAsia"/>
+        </w:rPr>
+      </w:pPr>
+      <w:r>
+        <w:rPr>
+          <w:rFonts w:hint="eastAsia"/>
+        </w:rPr>
+        <w:t>表</w:t>
+      </w:r>
+      <w:r>
+        <w:rPr>
+          <w:rFonts w:hint="eastAsia"/>
+        </w:rPr>
+        <w:t xml:space="preserve"> 1.1 </w:t>
+      </w:r>
+      <w:r>
+        <w:rPr>
+          <w:rFonts w:hint="eastAsia"/>
+        </w:rPr>
+        <w:t>核心资产规模与管养类型统计表</w:t>
+      </w:r>
+    </w:p>
+    <w:tbl>
+      <w:tblPr>
+        <w:tblStyle w:val="ab"/>
+        <w:tblW w:w="0" w:type="auto"/>
+        <w:jc w:val="center"/>
+        <w:tblLook w:val="04A0" w:firstRow="1" w:lastRow="0" w:firstColumn="1" w:lastColumn="0" w:noHBand="0" w:noVBand="1"/>
+      </w:tblPr>
+      <w:tblGrid>
+        <w:gridCol w:w="1812"/>
+        <w:gridCol w:w="1812"/>
+        <w:gridCol w:w="1812"/>
+        <w:gridCol w:w="1813"/>
+        <w:gridCol w:w="1813"/>
+      </w:tblGrid>
+      <w:tr>
+        <w:trPr>
+          <w:cnfStyle w:val="100000000000" w:firstRow="1" w:lastRow="0" w:firstColumn="0" w:lastColumn="0" w:oddVBand="0" w:evenVBand="0" w:oddHBand="0" w:evenHBand="0" w:firstRowFirstColumn="0" w:firstRowLastColumn="0" w:lastRowFirstColumn="0" w:lastRowLastColumn="0"/>
+          <w:jc w:val="center"/>
+        </w:trPr>
+        <w:tc>
+          <w:tcPr>
+            <w:tcW w:w="1812" w:type="dxa"/>
+          </w:tcPr>
+          <w:p>
+            <w:pPr>
+              <w:pStyle w:val="a9"/>
+              <w:rPr>
+                <w:rFonts w:hint="eastAsia"/>
+              </w:rPr>
+            </w:pPr>
+            <w:r>
+              <w:rPr>
+                <w:rFonts w:hint="eastAsia"/>
+              </w:rPr>
+              <w:lastRenderedPageBreak/>
+              <w:t>资产分类</w:t>
+            </w:r>
+          </w:p>
+        </w:tc>
+        <w:tc>
+          <w:tcPr>
+            <w:tcW w:w="1812" w:type="dxa"/>
+          </w:tcPr>
+          <w:p>
+            <w:pPr>
+              <w:pStyle w:val="a9"/>
+              <w:rPr>
+                <w:rFonts w:hint="eastAsia"/>
+              </w:rPr>
+            </w:pPr>
+            <w:r>
+              <w:rPr>
+                <w:rFonts w:hint="eastAsia"/>
+              </w:rPr>
+              <w:t>设施名称</w:t>
+            </w:r>
+          </w:p>
+        </w:tc>
+        <w:tc>
+          <w:tcPr>
+            <w:tcW w:w="1812" w:type="dxa"/>
+          </w:tcPr>
+          <w:p>
+            <w:pPr>
+              <w:pStyle w:val="a9"/>
+              <w:rPr>
+                <w:rFonts w:hint="eastAsia"/>
+              </w:rPr>
+            </w:pPr>
+            <w:r>
+              <w:rPr>
+                <w:rFonts w:hint="eastAsia"/>
+              </w:rPr>
+              <w:t>结构类型</w:t>
+            </w:r>
+          </w:p>
+        </w:tc>
+        <w:tc>
+          <w:tcPr>
+            <w:tcW w:w="1813" w:type="dxa"/>
+          </w:tcPr>
+          <w:p>
+            <w:pPr>
+              <w:pStyle w:val="a9"/>
+              <w:rPr>
+                <w:rFonts w:hint="eastAsia"/>
+              </w:rPr>
+            </w:pPr>
+            <w:r>
+              <w:rPr>
+                <w:rFonts w:hint="eastAsia"/>
+              </w:rPr>
+              <w:t>服役年限</w:t>
+            </w:r>
+          </w:p>
+        </w:tc>
+        <w:tc>
+          <w:tcPr>
+            <w:tcW w:w="1813" w:type="dxa"/>
+          </w:tcPr>
+          <w:p>
+            <w:pPr>
+              <w:pStyle w:val="a9"/>
+              <w:rPr>
+                <w:rFonts w:hint="eastAsia"/>
+              </w:rPr>
+            </w:pPr>
+            <w:r>
+              <w:rPr>
+                <w:rFonts w:hint="eastAsia"/>
+              </w:rPr>
+              <w:t>管养等级</w:t>
+            </w:r>
+          </w:p>
+        </w:tc>
+      </w:tr>
+      <w:tr>
+        <w:trPr>
+          <w:jc w:val="center"/>
+        </w:trPr>
+        <w:tc>
+          <w:tcPr>
+            <w:tcW w:w="1812" w:type="dxa"/>
+          </w:tcPr>
+          <w:p>
+            <w:pPr>
+              <w:pStyle w:val="a9"/>
+              <w:rPr>
+                <w:rFonts w:hint="eastAsia"/>
+              </w:rPr>
+            </w:pPr>
+            <w:r>
+              <w:rPr>
+                <w:rFonts w:hint="eastAsia"/>
+              </w:rPr>
+              <w:t>特大桥梁</w:t>
+            </w:r>
+          </w:p>
+        </w:tc>
+        <w:tc>
+          <w:tcPr>
+            <w:tcW w:w="1812" w:type="dxa"/>
+          </w:tcPr>
+          <w:p>
+            <w:pPr>
+              <w:pStyle w:val="a9"/>
+              <w:rPr>
+                <w:rFonts w:hint="eastAsia"/>
+              </w:rPr>
+            </w:pPr>
+            <w:r>
+              <w:rPr>
+                <w:rFonts w:hint="eastAsia"/>
+              </w:rPr>
+              <w:t>朝天门长江大桥</w:t>
+            </w:r>
+          </w:p>
+        </w:tc>
+        <w:tc>
+          <w:tcPr>
+            <w:tcW w:w="1812" w:type="dxa"/>
+          </w:tcPr>
+          <w:p>
+            <w:pPr>
+              <w:pStyle w:val="a9"/>
+              <w:rPr>
+                <w:rFonts w:hint="eastAsia"/>
+              </w:rPr>
+            </w:pPr>
+            <w:r>
+              <w:rPr>
+                <w:rFonts w:hint="eastAsia"/>
+              </w:rPr>
+              <w:t>双线轨道钢桁梁拱桥</w:t>
+            </w:r>
+          </w:p>
+        </w:tc>
+        <w:tc>
+          <w:tcPr>
+            <w:tcW w:w="1813" w:type="dxa"/>
+          </w:tcPr>
+          <w:p>
+            <w:pPr>
+              <w:pStyle w:val="a9"/>
+              <w:rPr>
+                <w:rFonts w:hint="eastAsia"/>
+              </w:rPr>
+            </w:pPr>
+            <w:r>
+              <w:rPr>
+                <w:rFonts w:hint="eastAsia"/>
+              </w:rPr>
+              <w:t>15</w:t>
+            </w:r>
+            <w:r>
+              <w:rPr>
+                <w:rFonts w:hint="eastAsia"/>
+              </w:rPr>
+              <w:t>年</w:t>
+            </w:r>
+          </w:p>
+        </w:tc>
+        <w:tc>
+          <w:tcPr>
+            <w:tcW w:w="1813" w:type="dxa"/>
+          </w:tcPr>
+          <w:p>
+            <w:pPr>
+              <w:pStyle w:val="a9"/>
+              <w:rPr>
+                <w:rFonts w:hint="eastAsia"/>
+              </w:rPr>
+            </w:pPr>
+            <w:r>
+              <w:rPr>
+                <w:rFonts w:hint="eastAsia"/>
+              </w:rPr>
+              <w:t>特级</w:t>
+            </w:r>
+          </w:p>
+        </w:tc>
+      </w:tr>
+      <w:tr>
+        <w:trPr>
+          <w:jc w:val="center"/>
+        </w:trPr>
+        <w:tc>
+          <w:tcPr>
+            <w:tcW w:w="1812" w:type="dxa"/>
+          </w:tcPr>
+          <w:p>
+            <w:pPr>
+              <w:pStyle w:val="a9"/>
+              <w:rPr>
+                <w:rFonts w:hint="eastAsia"/>
+              </w:rPr>
+            </w:pPr>
+            <w:r>
+              <w:rPr>
+                <w:rFonts w:hint="eastAsia"/>
+              </w:rPr>
+              <w:t>特大桥梁</w:t>
+            </w:r>
+          </w:p>
+        </w:tc>
+        <w:tc>
+          <w:tcPr>
+            <w:tcW w:w="1812" w:type="dxa"/>
+          </w:tcPr>
+          <w:p>
+            <w:pPr>
+              <w:pStyle w:val="a9"/>
+              <w:rPr>
+                <w:rFonts w:hint="eastAsia"/>
+              </w:rPr>
+            </w:pPr>
+            <w:r>
+              <w:rPr>
+                <w:rFonts w:hint="eastAsia"/>
+              </w:rPr>
+              <w:t>菜园坝长江大桥</w:t>
+            </w:r>
+          </w:p>
+        </w:tc>
+        <w:tc>
+          <w:tcPr>
+            <w:tcW w:w="1812" w:type="dxa"/>
+          </w:tcPr>
+          <w:p>
+            <w:pPr>
+              <w:pStyle w:val="a9"/>
+              <w:rPr>
+                <w:rFonts w:hint="eastAsia"/>
+              </w:rPr>
+            </w:pPr>
+            <w:r>
+              <w:rPr>
+                <w:rFonts w:hint="eastAsia"/>
+              </w:rPr>
+              <w:t>中承式钢箱系杆拱桥</w:t>
+            </w:r>
+          </w:p>
+        </w:tc>
+        <w:tc>
+          <w:tcPr>
+            <w:tcW w:w="1813" w:type="dxa"/>
+          </w:tcPr>
+          <w:p>
+            <w:pPr>
+              <w:pStyle w:val="a9"/>
+              <w:rPr>
+                <w:rFonts w:hint="eastAsia"/>
+              </w:rPr>
+            </w:pPr>
+            <w:r>
+              <w:rPr>
+                <w:rFonts w:hint="eastAsia"/>
+              </w:rPr>
+              <w:t>18</w:t>
+            </w:r>
+            <w:r>
+              <w:rPr>
+                <w:rFonts w:hint="eastAsia"/>
+              </w:rPr>
+              <w:t>年</w:t>
+            </w:r>
+          </w:p>
+        </w:tc>
+        <w:tc>
+          <w:tcPr>
+            <w:tcW w:w="1813" w:type="dxa"/>
+          </w:tcPr>
+          <w:p>
+            <w:pPr>
+              <w:pStyle w:val="a9"/>
+              <w:rPr>
+                <w:rFonts w:hint="eastAsia"/>
+              </w:rPr>
+            </w:pPr>
+            <w:r>
+              <w:rPr>
+                <w:rFonts w:hint="eastAsia"/>
+              </w:rPr>
+              <w:t>特级</w:t>
+            </w:r>
+          </w:p>
+        </w:tc>
+      </w:tr>
+      <w:tr>
+        <w:trPr>
+          <w:jc w:val="center"/>
+        </w:trPr>
+        <w:tc>
+          <w:tcPr>
+            <w:tcW w:w="1812" w:type="dxa"/>
+          </w:tcPr>
+          <w:p>
+            <w:pPr>
+              <w:pStyle w:val="a9"/>
+              <w:rPr>
+                <w:rFonts w:hint="eastAsia"/>
+              </w:rPr>
+            </w:pPr>
+            <w:r>
+              <w:rPr>
+                <w:rFonts w:hint="eastAsia"/>
+              </w:rPr>
+              <w:t>特长隧道</w:t>
+            </w:r>
+          </w:p>
+        </w:tc>
+        <w:tc>
+          <w:tcPr>
+            <w:tcW w:w="1812" w:type="dxa"/>
+          </w:tcPr>
+          <w:p>
+            <w:pPr>
+              <w:pStyle w:val="a9"/>
+              <w:rPr>
+                <w:rFonts w:hint="eastAsia"/>
+              </w:rPr>
+            </w:pPr>
+            <w:r>
+              <w:rPr>
+                <w:rFonts w:hint="eastAsia"/>
+              </w:rPr>
+              <w:t>双碑隧道</w:t>
+            </w:r>
+          </w:p>
+        </w:tc>
+        <w:tc>
+          <w:tcPr>
+            <w:tcW w:w="1812" w:type="dxa"/>
+          </w:tcPr>
+          <w:p>
+            <w:pPr>
+              <w:pStyle w:val="a9"/>
+              <w:rPr>
+                <w:rFonts w:hint="eastAsia"/>
+              </w:rPr>
+            </w:pPr>
+            <w:r>
+              <w:rPr>
+                <w:rFonts w:hint="eastAsia"/>
+              </w:rPr>
+              <w:t>分离式特长双洞公路隧道</w:t>
+            </w:r>
+          </w:p>
+        </w:tc>
+        <w:tc>
+          <w:tcPr>
+            <w:tcW w:w="1813" w:type="dxa"/>
+          </w:tcPr>
+          <w:p>
+            <w:pPr>
+              <w:pStyle w:val="a9"/>
+              <w:rPr>
+                <w:rFonts w:hint="eastAsia"/>
+              </w:rPr>
+            </w:pPr>
+            <w:r>
+              <w:rPr>
+                <w:rFonts w:hint="eastAsia"/>
+              </w:rPr>
+              <w:t>11</w:t>
+            </w:r>
+            <w:r>
+              <w:rPr>
+                <w:rFonts w:hint="eastAsia"/>
+              </w:rPr>
+              <w:t>年</w:t>
+            </w:r>
+          </w:p>
+        </w:tc>
+        <w:tc>
+          <w:tcPr>
+            <w:tcW w:w="1813" w:type="dxa"/>
+          </w:tcPr>
+          <w:p>
+            <w:pPr>
+              <w:pStyle w:val="a9"/>
+              <w:rPr>
+                <w:rFonts w:hint="eastAsia"/>
+              </w:rPr>
+            </w:pPr>
+            <w:r>
+              <w:rPr>
+                <w:rFonts w:hint="eastAsia"/>
+              </w:rPr>
+              <w:t>一级</w:t>
+            </w:r>
+          </w:p>
+        </w:tc>
+      </w:tr>
+    </w:tbl>
+    <w:p>
+      <w:pPr>
+        <w:ind w:firstLine="480"/>
+      </w:pPr>
+    </w:p>
+    <w:p>
+      <w:pPr>
+        <w:rPr>
+          <w:rFonts w:hint="eastAsia"/>
+        </w:rPr>
+      </w:pPr>
+    </w:p>
+    <w:p>
+      <w:pPr>
+        <w:pStyle w:val="a9"/>
+        <w:rPr>
+          <w:rStyle w:val="ae"/>
+          <w:b w:val="0"/>
+          <w:bCs w:val="0"/>
+        </w:rPr>
+      </w:pPr>
+      <w:r>
+        <w:rPr>
+          <w:rStyle w:val="ae"/>
+          <w:rFonts w:hint="eastAsia"/>
+          <w:b w:val="0"/>
+          <w:bCs w:val="0"/>
+        </w:rPr>
+        <w:t>图</w:t>
+      </w:r>
+      <w:r>
+        <w:rPr>
+          <w:rStyle w:val="ae"/>
+          <w:rFonts w:hint="eastAsia"/>
+          <w:b w:val="0"/>
+          <w:bCs w:val="0"/>
+        </w:rPr>
+        <w:t xml:space="preserve"> 1.1 </w:t>
+      </w:r>
+      <w:r>
+        <w:rPr>
+          <w:rStyle w:val="ae"/>
+          <w:rFonts w:hint="eastAsia"/>
+          <w:b w:val="0"/>
+          <w:bCs w:val="0"/>
+        </w:rPr>
+        <w:t>数智路桥总体架构与业务闭环流程图</w:t>
+      </w:r>
+    </w:p>
     <w:sectPr>
       <w:footerReference w:type="default" r:id="rId8"/>
       <w:pgSz w:w="11906" w:h="16838"/>
@@ -21,6 +741,7 @@
     <w:p>
       <w:pPr>
         <w:spacing w:line="240" w:lineRule="auto"/>
+        <w:ind w:firstLine="480"/>
       </w:pPr>
       <w:r>
         <w:separator/>
@@ -31,6 +752,7 @@
     <w:p>
       <w:pPr>
         <w:spacing w:line="240" w:lineRule="auto"/>
+        <w:ind w:firstLine="480"/>
       </w:pPr>
       <w:r>
         <w:continuationSeparator/>
@@ -139,7 +861,7 @@
         <w:sz w:val="28"/>
         <w:szCs w:val="28"/>
       </w:rPr>
-      <w:t>1</w:t>
+      <w:t>2</w:t>
     </w:r>
     <w:r>
       <w:rPr>
@@ -167,6 +889,7 @@
     <w:p>
       <w:pPr>
         <w:spacing w:line="240" w:lineRule="auto"/>
+        <w:ind w:firstLine="480"/>
       </w:pPr>
       <w:r>
         <w:separator/>
@@ -177,6 +900,7 @@
     <w:p>
       <w:pPr>
         <w:spacing w:line="240" w:lineRule="auto"/>
+        <w:ind w:firstLine="480"/>
       </w:pPr>
       <w:r>
         <w:continuationSeparator/>
@@ -195,7 +919,6 @@
     <w:lvl w:ilvl="0">
       <w:start w:val="1"/>
       <w:numFmt w:val="decimal"/>
-      <w:pStyle w:val="3"/>
       <w:suff w:val="nothing"/>
       <w:lvlText w:val="%1."/>
       <w:lvlJc w:val="left"/>
@@ -206,20 +929,204 @@
         <w:ind w:left="0" w:firstLine="0"/>
       </w:pPr>
       <w:rPr>
-        <w:rFonts w:ascii="Times New Roman" w:eastAsia="方正仿宋_GBK" w:hAnsi="Times New Roman" w:cs="宋体" w:hint="default"/>
+        <w:rFonts w:ascii="Times New Roman" w:eastAsia="方正仿宋_GBK" w:hAnsi="Times New Roman" w:cs="SimSun" w:hint="default"/>
         <w:sz w:val="32"/>
         <w:szCs w:val="32"/>
       </w:rPr>
     </w:lvl>
   </w:abstractNum>
   <w:abstractNum w:abstractNumId="1" w15:restartNumberingAfterBreak="0">
+    <w:nsid w:val="FFFFFF7C"/>
+    <w:multiLevelType w:val="singleLevel"/>
+    <w:tmpl w:val="C024AC3E"/>
+    <w:lvl w:ilvl="0">
+      <w:start w:val="1"/>
+      <w:numFmt w:val="decimal"/>
+      <w:lvlText w:val="%1."/>
+      <w:lvlJc w:val="left"/>
+      <w:pPr>
+        <w:tabs>
+          <w:tab w:val="num" w:pos="1492"/>
+        </w:tabs>
+        <w:ind w:left="1492" w:hanging="360"/>
+      </w:pPr>
+    </w:lvl>
+  </w:abstractNum>
+  <w:abstractNum w:abstractNumId="2" w15:restartNumberingAfterBreak="0">
+    <w:nsid w:val="FFFFFF7D"/>
+    <w:multiLevelType w:val="singleLevel"/>
+    <w:tmpl w:val="B7525328"/>
+    <w:lvl w:ilvl="0">
+      <w:start w:val="1"/>
+      <w:numFmt w:val="decimal"/>
+      <w:lvlText w:val="%1."/>
+      <w:lvlJc w:val="left"/>
+      <w:pPr>
+        <w:tabs>
+          <w:tab w:val="num" w:pos="1209"/>
+        </w:tabs>
+        <w:ind w:left="1209" w:hanging="360"/>
+      </w:pPr>
+    </w:lvl>
+  </w:abstractNum>
+  <w:abstractNum w:abstractNumId="3" w15:restartNumberingAfterBreak="0">
+    <w:nsid w:val="FFFFFF7E"/>
+    <w:multiLevelType w:val="singleLevel"/>
+    <w:tmpl w:val="D1B2395C"/>
+    <w:lvl w:ilvl="0">
+      <w:start w:val="1"/>
+      <w:numFmt w:val="decimal"/>
+      <w:lvlText w:val="%1."/>
+      <w:lvlJc w:val="left"/>
+      <w:pPr>
+        <w:tabs>
+          <w:tab w:val="num" w:pos="926"/>
+        </w:tabs>
+        <w:ind w:left="926" w:hanging="360"/>
+      </w:pPr>
+    </w:lvl>
+  </w:abstractNum>
+  <w:abstractNum w:abstractNumId="4" w15:restartNumberingAfterBreak="0">
+    <w:nsid w:val="FFFFFF7F"/>
+    <w:multiLevelType w:val="singleLevel"/>
+    <w:tmpl w:val="99AAB0F8"/>
+    <w:lvl w:ilvl="0">
+      <w:start w:val="1"/>
+      <w:numFmt w:val="decimal"/>
+      <w:lvlText w:val="%1."/>
+      <w:lvlJc w:val="left"/>
+      <w:pPr>
+        <w:tabs>
+          <w:tab w:val="num" w:pos="643"/>
+        </w:tabs>
+        <w:ind w:left="643" w:hanging="360"/>
+      </w:pPr>
+    </w:lvl>
+  </w:abstractNum>
+  <w:abstractNum w:abstractNumId="5" w15:restartNumberingAfterBreak="0">
+    <w:nsid w:val="FFFFFF80"/>
+    <w:multiLevelType w:val="singleLevel"/>
+    <w:tmpl w:val="9E8E1960"/>
+    <w:lvl w:ilvl="0">
+      <w:start w:val="1"/>
+      <w:numFmt w:val="bullet"/>
+      <w:lvlText w:val=""/>
+      <w:lvlJc w:val="left"/>
+      <w:pPr>
+        <w:tabs>
+          <w:tab w:val="num" w:pos="1492"/>
+        </w:tabs>
+        <w:ind w:left="1492" w:hanging="360"/>
+      </w:pPr>
+      <w:rPr>
+        <w:rFonts w:ascii="Symbol" w:hAnsi="Symbol" w:hint="default"/>
+      </w:rPr>
+    </w:lvl>
+  </w:abstractNum>
+  <w:abstractNum w:abstractNumId="6" w15:restartNumberingAfterBreak="0">
+    <w:nsid w:val="FFFFFF81"/>
+    <w:multiLevelType w:val="singleLevel"/>
+    <w:tmpl w:val="ACC6B732"/>
+    <w:lvl w:ilvl="0">
+      <w:start w:val="1"/>
+      <w:numFmt w:val="bullet"/>
+      <w:lvlText w:val=""/>
+      <w:lvlJc w:val="left"/>
+      <w:pPr>
+        <w:tabs>
+          <w:tab w:val="num" w:pos="1209"/>
+        </w:tabs>
+        <w:ind w:left="1209" w:hanging="360"/>
+      </w:pPr>
+      <w:rPr>
+        <w:rFonts w:ascii="Symbol" w:hAnsi="Symbol" w:hint="default"/>
+      </w:rPr>
+    </w:lvl>
+  </w:abstractNum>
+  <w:abstractNum w:abstractNumId="7" w15:restartNumberingAfterBreak="0">
+    <w:nsid w:val="FFFFFF82"/>
+    <w:multiLevelType w:val="singleLevel"/>
+    <w:tmpl w:val="CF16FB62"/>
+    <w:lvl w:ilvl="0">
+      <w:start w:val="1"/>
+      <w:numFmt w:val="bullet"/>
+      <w:lvlText w:val=""/>
+      <w:lvlJc w:val="left"/>
+      <w:pPr>
+        <w:tabs>
+          <w:tab w:val="num" w:pos="926"/>
+        </w:tabs>
+        <w:ind w:left="926" w:hanging="360"/>
+      </w:pPr>
+      <w:rPr>
+        <w:rFonts w:ascii="Symbol" w:hAnsi="Symbol" w:hint="default"/>
+      </w:rPr>
+    </w:lvl>
+  </w:abstractNum>
+  <w:abstractNum w:abstractNumId="8" w15:restartNumberingAfterBreak="0">
+    <w:nsid w:val="FFFFFF83"/>
+    <w:multiLevelType w:val="singleLevel"/>
+    <w:tmpl w:val="B5C8648C"/>
+    <w:lvl w:ilvl="0">
+      <w:start w:val="1"/>
+      <w:numFmt w:val="bullet"/>
+      <w:lvlText w:val=""/>
+      <w:lvlJc w:val="left"/>
+      <w:pPr>
+        <w:tabs>
+          <w:tab w:val="num" w:pos="643"/>
+        </w:tabs>
+        <w:ind w:left="643" w:hanging="360"/>
+      </w:pPr>
+      <w:rPr>
+        <w:rFonts w:ascii="Symbol" w:hAnsi="Symbol" w:hint="default"/>
+      </w:rPr>
+    </w:lvl>
+  </w:abstractNum>
+  <w:abstractNum w:abstractNumId="9" w15:restartNumberingAfterBreak="0">
+    <w:nsid w:val="FFFFFF88"/>
+    <w:multiLevelType w:val="singleLevel"/>
+    <w:tmpl w:val="6E82EA56"/>
+    <w:lvl w:ilvl="0">
+      <w:start w:val="1"/>
+      <w:numFmt w:val="decimal"/>
+      <w:lvlText w:val="%1."/>
+      <w:lvlJc w:val="left"/>
+      <w:pPr>
+        <w:tabs>
+          <w:tab w:val="num" w:pos="360"/>
+        </w:tabs>
+        <w:ind w:left="360" w:hanging="360"/>
+      </w:pPr>
+    </w:lvl>
+  </w:abstractNum>
+  <w:abstractNum w:abstractNumId="10" w15:restartNumberingAfterBreak="0">
+    <w:nsid w:val="FFFFFF89"/>
+    <w:multiLevelType w:val="singleLevel"/>
+    <w:tmpl w:val="9DDEED06"/>
+    <w:lvl w:ilvl="0">
+      <w:start w:val="1"/>
+      <w:numFmt w:val="bullet"/>
+      <w:lvlText w:val=""/>
+      <w:lvlJc w:val="left"/>
+      <w:pPr>
+        <w:tabs>
+          <w:tab w:val="num" w:pos="360"/>
+        </w:tabs>
+        <w:ind w:left="360" w:hanging="360"/>
+      </w:pPr>
+      <w:rPr>
+        <w:rFonts w:ascii="Symbol" w:hAnsi="Symbol" w:hint="default"/>
+      </w:rPr>
+    </w:lvl>
+  </w:abstractNum>
+  <w:abstractNum w:abstractNumId="11" w15:restartNumberingAfterBreak="0">
     <w:nsid w:val="1BE8A4B3"/>
     <w:multiLevelType w:val="singleLevel"/>
     <w:tmpl w:val="1BE8A4B3"/>
     <w:lvl w:ilvl="0">
       <w:start w:val="1"/>
       <w:numFmt w:val="chineseCounting"/>
-      <w:pStyle w:val="1"/>
       <w:suff w:val="nothing"/>
       <w:lvlText w:val="%1、"/>
       <w:lvlJc w:val="left"/>
@@ -233,14 +1140,13 @@
       </w:rPr>
     </w:lvl>
   </w:abstractNum>
-  <w:abstractNum w:abstractNumId="2" w15:restartNumberingAfterBreak="0">
+  <w:abstractNum w:abstractNumId="12" w15:restartNumberingAfterBreak="0">
     <w:nsid w:val="3CB22176"/>
     <w:multiLevelType w:val="singleLevel"/>
     <w:tmpl w:val="3CB22176"/>
     <w:lvl w:ilvl="0">
       <w:start w:val="1"/>
       <w:numFmt w:val="decimal"/>
-      <w:pStyle w:val="4"/>
       <w:suff w:val="nothing"/>
       <w:lvlText w:val="（%1）"/>
       <w:lvlJc w:val="left"/>
@@ -251,20 +1157,19 @@
         <w:ind w:left="0" w:firstLine="0"/>
       </w:pPr>
       <w:rPr>
-        <w:rFonts w:ascii="Times New Roman" w:eastAsia="方正仿宋_GBK" w:hAnsi="Times New Roman" w:cs="宋体" w:hint="default"/>
+        <w:rFonts w:ascii="Times New Roman" w:eastAsia="方正仿宋_GBK" w:hAnsi="Times New Roman" w:cs="SimSun" w:hint="default"/>
         <w:sz w:val="32"/>
         <w:szCs w:val="32"/>
       </w:rPr>
     </w:lvl>
   </w:abstractNum>
-  <w:abstractNum w:abstractNumId="3" w15:restartNumberingAfterBreak="0">
+  <w:abstractNum w:abstractNumId="13" w15:restartNumberingAfterBreak="0">
     <w:nsid w:val="7E8B009F"/>
     <w:multiLevelType w:val="singleLevel"/>
     <w:tmpl w:val="7E8B009F"/>
     <w:lvl w:ilvl="0">
       <w:start w:val="1"/>
       <w:numFmt w:val="chineseCounting"/>
-      <w:pStyle w:val="2"/>
       <w:suff w:val="nothing"/>
       <w:lvlText w:val="（%1）"/>
       <w:lvlJc w:val="left"/>
@@ -282,16 +1187,16 @@
     </w:lvl>
   </w:abstractNum>
   <w:num w:numId="1">
-    <w:abstractNumId w:val="1"/>
+    <w:abstractNumId w:val="11"/>
   </w:num>
   <w:num w:numId="2">
-    <w:abstractNumId w:val="3"/>
+    <w:abstractNumId w:val="13"/>
   </w:num>
   <w:num w:numId="3">
     <w:abstractNumId w:val="0"/>
   </w:num>
   <w:num w:numId="4">
-    <w:abstractNumId w:val="2"/>
+    <w:abstractNumId w:val="12"/>
   </w:num>
   <w:num w:numId="5">
     <w:abstractNumId w:val="0"/>
@@ -317,15 +1222,45 @@
       <w:startOverride w:val="1"/>
     </w:lvlOverride>
   </w:num>
+  <w:num w:numId="9">
+    <w:abstractNumId w:val="9"/>
+  </w:num>
+  <w:num w:numId="10">
+    <w:abstractNumId w:val="4"/>
+  </w:num>
+  <w:num w:numId="11">
+    <w:abstractNumId w:val="3"/>
+  </w:num>
+  <w:num w:numId="12">
+    <w:abstractNumId w:val="2"/>
+  </w:num>
+  <w:num w:numId="13">
+    <w:abstractNumId w:val="1"/>
+  </w:num>
+  <w:num w:numId="14">
+    <w:abstractNumId w:val="10"/>
+  </w:num>
+  <w:num w:numId="15">
+    <w:abstractNumId w:val="8"/>
+  </w:num>
+  <w:num w:numId="16">
+    <w:abstractNumId w:val="7"/>
+  </w:num>
+  <w:num w:numId="17">
+    <w:abstractNumId w:val="6"/>
+  </w:num>
+  <w:num w:numId="18">
+    <w:abstractNumId w:val="5"/>
+  </w:num>
 </w:numbering>
 </file>
 
 <file path=word/styles.xml><?xml version="1.0" encoding="utf-8"?>
-<w:styles xmlns:ns1="http://schemas.openxmlformats.org/markup-compatibility/2006" xmlns:w="http://schemas.openxmlformats.org/wordprocessingml/2006/main" ns1:Ignorable="w14 w15 w16se w16cid w16 w16cex w16sdtdh">
+<w:styles xmlns:mc="http://schemas.openxmlformats.org/markup-compatibility/2006" xmlns:r="http://schemas.openxmlformats.org/officeDocument/2006/relationships" xmlns:w="http://schemas.openxmlformats.org/wordprocessingml/2006/main" xmlns:w14="http://schemas.microsoft.com/office/word/2010/wordml" xmlns:w15="http://schemas.microsoft.com/office/word/2012/wordml" xmlns:w16cex="http://schemas.microsoft.com/office/word/2018/wordml/cex" xmlns:w16cid="http://schemas.microsoft.com/office/word/2016/wordml/cid" xmlns:w16="http://schemas.microsoft.com/office/word/2018/wordml" xmlns:w16sdtdh="http://schemas.microsoft.com/office/word/2020/wordml/sdtdatahash" xmlns:w16se="http://schemas.microsoft.com/office/word/2015/wordml/symex" mc:Ignorable="w14 w15 w16se w16cid w16 w16cex w16sdtdh">
   <w:docDefaults>
     <w:rPrDefault>
       <w:rPr>
-        <w:rFonts w:ascii="Times New Roman" w:eastAsia="宋体" w:hAnsi="Times New Roman" w:cs="Times New Roman"/>
+        <w:rFonts w:ascii="Times New Roman" w:eastAsia="SimSun" w:hAnsi="Times New Roman" w:cs="Times New Roman"/>
         <w:lang w:val="en-US" w:eastAsia="zh-CN" w:bidi="ar-SA"/>
       </w:rPr>
     </w:rPrDefault>
@@ -636,7 +1571,7 @@
       <w:szCs w:val="32"/>
     </w:rPr>
   </w:style>
-  <w:style w:type="paragraph" w:styleId="Heading1">
+  <w:style w:type="paragraph" w:styleId="1">
     <w:name w:val="heading 1"/>
     <w:basedOn w:val="a"/>
     <w:next w:val="a"/>
@@ -646,17 +1581,14 @@
       <w:keepLines/>
       <w:ind w:firstLineChars="200" w:firstLine="640"/>
       <w:outlineLvl w:val="0"/>
-      <w:spacing w:line="600" w:lineRule="exact"/>
     </w:pPr>
     <w:rPr>
-      <w:rFonts w:eastAsia="方正黑体_GBK" w:ascii="Times New Roman" w:hAnsi="Times New Roman" w:cs="Times New Roman"/>
+      <w:rFonts w:eastAsia="方正黑体_GBK"/>
+      <w:color w:val="000000"/>
       <w:kern w:val="44"/>
-      <w:color w:val="000000"/>
-      <w:sz w:val="32"/>
-      <w:szCs w:val="32"/>
     </w:rPr>
   </w:style>
-  <w:style w:type="paragraph" w:styleId="Heading2">
+  <w:style w:type="paragraph" w:styleId="2">
     <w:name w:val="heading 2"/>
     <w:basedOn w:val="a"/>
     <w:next w:val="a"/>
@@ -667,16 +1599,13 @@
       <w:keepLines/>
       <w:ind w:firstLineChars="200" w:firstLine="640"/>
       <w:outlineLvl w:val="1"/>
-      <w:spacing w:line="600" w:lineRule="exact"/>
     </w:pPr>
     <w:rPr>
-      <w:rFonts w:ascii="Times New Roman" w:eastAsia="方正楷体_GBK" w:hAnsi="Times New Roman" w:cs="Times New Roman"/>
+      <w:rFonts w:eastAsia="方正楷体_GBK"/>
       <w:color w:val="000000"/>
-      <w:sz w:val="32"/>
-      <w:szCs w:val="32"/>
     </w:rPr>
   </w:style>
-  <w:style w:type="paragraph" w:styleId="Heading3">
+  <w:style w:type="paragraph" w:styleId="3">
     <w:name w:val="heading 3"/>
     <w:basedOn w:val="a"/>
     <w:next w:val="a"/>
@@ -688,17 +1617,13 @@
       <w:keepLines/>
       <w:ind w:firstLineChars="200" w:firstLine="640"/>
       <w:outlineLvl w:val="2"/>
-      <w:spacing w:line="600" w:lineRule="exact"/>
     </w:pPr>
     <w:rPr>
+      <w:b/>
       <w:color w:val="000000"/>
-      <w:rFonts w:ascii="Times New Roman" w:hAnsi="Times New Roman" w:eastAsia="方正仿宋_GBK" w:cs="Times New Roman"/>
-      <w:sz w:val="32"/>
-      <w:szCs w:val="32"/>
-      <w:b/>
     </w:rPr>
   </w:style>
-  <w:style w:type="paragraph" w:styleId="Heading4">
+  <w:style w:type="paragraph" w:styleId="4">
     <w:name w:val="heading 4"/>
     <w:basedOn w:val="a"/>
     <w:next w:val="a"/>
@@ -709,19 +1634,14 @@
       <w:keepLines/>
       <w:ind w:firstLineChars="200" w:firstLine="640"/>
       <w:outlineLvl w:val="3"/>
-      <w:spacing w:line="600" w:lineRule="exact"/>
     </w:pPr>
     <w:rPr>
       <w:color w:val="000000"/>
-      <w:rFonts w:ascii="Times New Roman" w:hAnsi="Times New Roman" w:eastAsia="方正仿宋_GBK" w:cs="Times New Roman"/>
-      <w:sz w:val="32"/>
-      <w:szCs w:val="32"/>
     </w:rPr>
   </w:style>
   <w:style w:type="character" w:default="1" w:styleId="a0">
     <w:name w:val="Default Paragraph Font"/>
     <w:uiPriority w:val="1"/>
-    <w:semiHidden/>
     <w:unhideWhenUsed/>
   </w:style>
   <w:style w:type="table" w:default="1" w:styleId="a1">
@@ -795,7 +1715,7 @@
       <w:sz w:val="24"/>
     </w:rPr>
   </w:style>
-  <w:style w:type="paragraph" w:styleId="Title">
+  <w:style w:type="paragraph" w:styleId="a7">
     <w:name w:val="Title"/>
     <w:basedOn w:val="a"/>
     <w:next w:val="a"/>
@@ -808,7 +1728,7 @@
       <w:outlineLvl w:val="0"/>
     </w:pPr>
     <w:rPr>
-      <w:rFonts w:eastAsia="方正小标宋_GBK" w:ascii="Times New Roman" w:hAnsi="Times New Roman" w:cs="Times New Roman"/>
+      <w:rFonts w:eastAsia="方正小标宋_GBK"/>
       <w:sz w:val="44"/>
       <w:szCs w:val="44"/>
     </w:rPr>
@@ -845,27 +1765,27 @@
     <w:basedOn w:val="a"/>
     <w:link w:val="aa"/>
     <w:qFormat/>
-    <w:rsid w:val="006A098D"/>
+    <w:rsid w:val="00EA411A"/>
     <w:pPr>
       <w:spacing w:line="240" w:lineRule="auto"/>
       <w:jc w:val="center"/>
     </w:pPr>
     <w:rPr>
-      <w:rFonts w:eastAsia="方正黑体_GBK"/>
+      <w:rFonts w:eastAsiaTheme="minorEastAsia"/>
       <w:noProof/>
-      <w:sz w:val="21"/>
+      <w:sz w:val="24"/>
     </w:rPr>
   </w:style>
   <w:style w:type="character" w:customStyle="1" w:styleId="aa">
     <w:name w:val="图片 字符"/>
     <w:basedOn w:val="a0"/>
     <w:link w:val="a9"/>
-    <w:rsid w:val="006A098D"/>
+    <w:rsid w:val="00EA411A"/>
     <w:rPr>
-      <w:rFonts w:eastAsia="方正黑体_GBK"/>
+      <w:rFonts w:eastAsiaTheme="minorEastAsia"/>
       <w:noProof/>
       <w:kern w:val="2"/>
-      <w:sz w:val="21"/>
+      <w:sz w:val="24"/>
       <w:szCs w:val="32"/>
     </w:rPr>
   </w:style>
@@ -898,20 +1818,65 @@
       </w:tcPr>
     </w:tblStylePr>
   </w:style>
-  <w:style w:type="paragraph" w:styleId="Subtitle">
+  <w:style w:type="paragraph" w:styleId="ac">
     <w:name w:val="Subtitle"/>
     <w:basedOn w:val="a"/>
     <w:next w:val="a"/>
     <w:qFormat/>
     <w:pPr>
-      <w:spacing w:line="600" w:lineRule="exact"/>
       <w:jc w:val="center"/>
-      <w:ind w:firstLine="0" w:firstLineChars="0"/>
     </w:pPr>
     <w:rPr>
-      <w:rFonts w:eastAsia="方正楷体_GBK" w:ascii="Times New Roman" w:hAnsi="Times New Roman" w:cs="Times New Roman"/>
-      <w:sz w:val="32"/>
+      <w:rFonts w:eastAsia="方正楷体_GBK"/>
+    </w:rPr>
+  </w:style>
+  <w:style w:type="table" w:styleId="ad">
+    <w:name w:val="Table Grid"/>
+    <w:basedOn w:val="a1"/>
+    <w:rsid w:val="00EA411A"/>
+    <w:tblPr>
+      <w:tblBorders>
+        <w:top w:val="single" w:sz="4" w:space="0" w:color="auto"/>
+        <w:left w:val="single" w:sz="4" w:space="0" w:color="auto"/>
+        <w:bottom w:val="single" w:sz="4" w:space="0" w:color="auto"/>
+        <w:right w:val="single" w:sz="4" w:space="0" w:color="auto"/>
+        <w:insideH w:val="single" w:sz="4" w:space="0" w:color="auto"/>
+        <w:insideV w:val="single" w:sz="4" w:space="0" w:color="auto"/>
+      </w:tblBorders>
+    </w:tblPr>
+  </w:style>
+  <w:style w:type="paragraph" w:styleId="20">
+    <w:name w:val="Body Text 2"/>
+    <w:basedOn w:val="a"/>
+    <w:link w:val="21"/>
+    <w:rsid w:val="00EA411A"/>
+    <w:pPr>
+      <w:spacing w:line="240" w:lineRule="auto"/>
+    </w:pPr>
+    <w:rPr>
+      <w:sz w:val="24"/>
+    </w:rPr>
+  </w:style>
+  <w:style w:type="character" w:customStyle="1" w:styleId="21">
+    <w:name w:val="正文文本 2 字符"/>
+    <w:basedOn w:val="a0"/>
+    <w:link w:val="20"/>
+    <w:rsid w:val="00EA411A"/>
+    <w:rPr>
+      <w:rFonts w:eastAsia="方正仿宋_GBK"/>
+      <w:kern w:val="2"/>
+      <w:sz w:val="24"/>
       <w:szCs w:val="32"/>
+    </w:rPr>
+  </w:style>
+  <w:style w:type="character" w:styleId="ae">
+    <w:name w:val="Strong"/>
+    <w:basedOn w:val="a0"/>
+    <w:qFormat/>
+    <w:rsid w:val="00EA411A"/>
+    <w:rPr>
+      <w:b/>
+      <w:bCs/>
     </w:rPr>
   </w:style>
 </w:styles>

</xml_diff>